<commit_message>
Fig 2e (nature-figure pass): drop 3 unverified 2026 reports; cleaner benchmark
Per PI: removed Gu/Zhang/Xiang 2026 (unverifiable, future-dated) from the benchmark CSV and SI Table S1. Regenerated panel (e) via the nature-figure workflow: dropped the rate->marker-size encoding (avoids size=importance misread), restricted rate labels to the frontier points (~C/20, 1C, 50C), uniform confidence-coded markers, fixed Table S1 ref. This work remains on the Pareto front (highest CE among long-cycle Mg full cells, at 1C). No fabrication; verified literature values only.

Co-Authored-By: Claude Opus 4.8 <noreply@anthropic.com>
</commit_message>
<xml_diff>
--- a/manuscript/Supporting_Information_polyAPC_Angew.docx
+++ b/manuscript/Supporting_Information_polyAPC_Angew.docx
@@ -2709,432 +2709,6 @@
           </w:p>
         </w:tc>
       </w:tr>
-      <w:tr>
-        <w:tc>
-          <w:tcPr>
-            <w:tcW w:type="dxa" w:w="864"/>
-          </w:tcPr>
-          <w:p>
-            <w:r>
-              <w:rPr>
-                <w:rFonts w:eastAsia="宋体"/>
-                <w:sz w:val="12"/>
-              </w:rPr>
-              <w:t>Gu 2026</w:t>
-            </w:r>
-          </w:p>
-        </w:tc>
-        <w:tc>
-          <w:tcPr>
-            <w:tcW w:type="dxa" w:w="864"/>
-          </w:tcPr>
-          <w:p>
-            <w:r>
-              <w:rPr>
-                <w:rFonts w:eastAsia="宋体"/>
-                <w:sz w:val="12"/>
-              </w:rPr>
-              <w:t>Mo6S8</w:t>
-            </w:r>
-          </w:p>
-        </w:tc>
-        <w:tc>
-          <w:tcPr>
-            <w:tcW w:type="dxa" w:w="864"/>
-          </w:tcPr>
-          <w:p>
-            <w:r>
-              <w:rPr>
-                <w:rFonts w:eastAsia="宋体"/>
-                <w:sz w:val="12"/>
-              </w:rPr>
-              <w:t>Mg(OTf)2 + InBr3/BHFP</w:t>
-            </w:r>
-          </w:p>
-        </w:tc>
-        <w:tc>
-          <w:tcPr>
-            <w:tcW w:type="dxa" w:w="864"/>
-          </w:tcPr>
-          <w:p>
-            <w:r>
-              <w:rPr>
-                <w:rFonts w:eastAsia="宋体"/>
-                <w:sz w:val="12"/>
-              </w:rPr>
-              <w:t>1700</w:t>
-            </w:r>
-          </w:p>
-        </w:tc>
-        <w:tc>
-          <w:tcPr>
-            <w:tcW w:type="dxa" w:w="864"/>
-          </w:tcPr>
-          <w:p>
-            <w:r>
-              <w:rPr>
-                <w:rFonts w:eastAsia="宋体"/>
-                <w:sz w:val="12"/>
-              </w:rPr>
-              <w:t>NA</w:t>
-            </w:r>
-          </w:p>
-        </w:tc>
-        <w:tc>
-          <w:tcPr>
-            <w:tcW w:type="dxa" w:w="864"/>
-          </w:tcPr>
-          <w:p>
-            <w:r>
-              <w:rPr>
-                <w:rFonts w:eastAsia="宋体"/>
-                <w:sz w:val="12"/>
-              </w:rPr>
-              <w:t>83.7</w:t>
-            </w:r>
-          </w:p>
-        </w:tc>
-        <w:tc>
-          <w:tcPr>
-            <w:tcW w:type="dxa" w:w="864"/>
-          </w:tcPr>
-          <w:p>
-            <w:r>
-              <w:rPr>
-                <w:rFonts w:eastAsia="宋体"/>
-                <w:sz w:val="12"/>
-              </w:rPr>
-              <w:t>1.0</w:t>
-            </w:r>
-          </w:p>
-        </w:tc>
-        <w:tc>
-          <w:tcPr>
-            <w:tcW w:type="dxa" w:w="864"/>
-          </w:tcPr>
-          <w:p>
-            <w:r>
-              <w:rPr>
-                <w:rFonts w:eastAsia="宋体"/>
-                <w:sz w:val="12"/>
-              </w:rPr>
-              <w:t>2026</w:t>
-            </w:r>
-          </w:p>
-        </w:tc>
-        <w:tc>
-          <w:tcPr>
-            <w:tcW w:type="dxa" w:w="864"/>
-          </w:tcPr>
-          <w:p>
-            <w:r>
-              <w:rPr>
-                <w:rFonts w:eastAsia="宋体"/>
-                <w:sz w:val="12"/>
-              </w:rPr>
-              <w:t>10.1002/aenm.70844</w:t>
-            </w:r>
-          </w:p>
-        </w:tc>
-        <w:tc>
-          <w:tcPr>
-            <w:tcW w:type="dxa" w:w="864"/>
-          </w:tcPr>
-          <w:p>
-            <w:r>
-              <w:rPr>
-                <w:rFonts w:eastAsia="宋体"/>
-                <w:sz w:val="12"/>
-              </w:rPr>
-              <w:t>low</w:t>
-            </w:r>
-          </w:p>
-        </w:tc>
-      </w:tr>
-      <w:tr>
-        <w:tc>
-          <w:tcPr>
-            <w:tcW w:type="dxa" w:w="864"/>
-          </w:tcPr>
-          <w:p>
-            <w:r>
-              <w:rPr>
-                <w:rFonts w:eastAsia="宋体"/>
-                <w:sz w:val="12"/>
-              </w:rPr>
-              <w:t>Zhang 2026</w:t>
-            </w:r>
-          </w:p>
-        </w:tc>
-        <w:tc>
-          <w:tcPr>
-            <w:tcW w:type="dxa" w:w="864"/>
-          </w:tcPr>
-          <w:p>
-            <w:r>
-              <w:rPr>
-                <w:rFonts w:eastAsia="宋体"/>
-                <w:sz w:val="12"/>
-              </w:rPr>
-              <w:t>Mo6S8</w:t>
-            </w:r>
-          </w:p>
-        </w:tc>
-        <w:tc>
-          <w:tcPr>
-            <w:tcW w:type="dxa" w:w="864"/>
-          </w:tcPr>
-          <w:p>
-            <w:r>
-              <w:rPr>
-                <w:rFonts w:eastAsia="宋体"/>
-                <w:sz w:val="12"/>
-              </w:rPr>
-              <w:t>boron dual-anion (YBTFC)</w:t>
-            </w:r>
-          </w:p>
-        </w:tc>
-        <w:tc>
-          <w:tcPr>
-            <w:tcW w:type="dxa" w:w="864"/>
-          </w:tcPr>
-          <w:p>
-            <w:r>
-              <w:rPr>
-                <w:rFonts w:eastAsia="宋体"/>
-                <w:sz w:val="12"/>
-              </w:rPr>
-              <w:t>4500</w:t>
-            </w:r>
-          </w:p>
-        </w:tc>
-        <w:tc>
-          <w:tcPr>
-            <w:tcW w:type="dxa" w:w="864"/>
-          </w:tcPr>
-          <w:p>
-            <w:r>
-              <w:rPr>
-                <w:rFonts w:eastAsia="宋体"/>
-                <w:sz w:val="12"/>
-              </w:rPr>
-              <w:t>NA</w:t>
-            </w:r>
-          </w:p>
-        </w:tc>
-        <w:tc>
-          <w:tcPr>
-            <w:tcW w:type="dxa" w:w="864"/>
-          </w:tcPr>
-          <w:p>
-            <w:r>
-              <w:rPr>
-                <w:rFonts w:eastAsia="宋体"/>
-                <w:sz w:val="12"/>
-              </w:rPr>
-              <w:t>NA</w:t>
-            </w:r>
-          </w:p>
-        </w:tc>
-        <w:tc>
-          <w:tcPr>
-            <w:tcW w:type="dxa" w:w="864"/>
-          </w:tcPr>
-          <w:p>
-            <w:r>
-              <w:rPr>
-                <w:rFonts w:eastAsia="宋体"/>
-                <w:sz w:val="12"/>
-              </w:rPr>
-              <w:t>3.0</w:t>
-            </w:r>
-          </w:p>
-        </w:tc>
-        <w:tc>
-          <w:tcPr>
-            <w:tcW w:type="dxa" w:w="864"/>
-          </w:tcPr>
-          <w:p>
-            <w:r>
-              <w:rPr>
-                <w:rFonts w:eastAsia="宋体"/>
-                <w:sz w:val="12"/>
-              </w:rPr>
-              <w:t>2026</w:t>
-            </w:r>
-          </w:p>
-        </w:tc>
-        <w:tc>
-          <w:tcPr>
-            <w:tcW w:type="dxa" w:w="864"/>
-          </w:tcPr>
-          <w:p>
-            <w:r>
-              <w:rPr>
-                <w:rFonts w:eastAsia="宋体"/>
-                <w:sz w:val="12"/>
-              </w:rPr>
-              <w:t>10.1002/adfm.202520292</w:t>
-            </w:r>
-          </w:p>
-        </w:tc>
-        <w:tc>
-          <w:tcPr>
-            <w:tcW w:type="dxa" w:w="864"/>
-          </w:tcPr>
-          <w:p>
-            <w:r>
-              <w:rPr>
-                <w:rFonts w:eastAsia="宋体"/>
-                <w:sz w:val="12"/>
-              </w:rPr>
-              <w:t>low</w:t>
-            </w:r>
-          </w:p>
-        </w:tc>
-      </w:tr>
-      <w:tr>
-        <w:tc>
-          <w:tcPr>
-            <w:tcW w:type="dxa" w:w="864"/>
-          </w:tcPr>
-          <w:p>
-            <w:r>
-              <w:rPr>
-                <w:rFonts w:eastAsia="宋体"/>
-                <w:sz w:val="12"/>
-              </w:rPr>
-              <w:t>Xiang 2026</w:t>
-            </w:r>
-          </w:p>
-        </w:tc>
-        <w:tc>
-          <w:tcPr>
-            <w:tcW w:type="dxa" w:w="864"/>
-          </w:tcPr>
-          <w:p>
-            <w:r>
-              <w:rPr>
-                <w:rFonts w:eastAsia="宋体"/>
-                <w:sz w:val="12"/>
-              </w:rPr>
-              <w:t>Mo6S8</w:t>
-            </w:r>
-          </w:p>
-        </w:tc>
-        <w:tc>
-          <w:tcPr>
-            <w:tcW w:type="dxa" w:w="864"/>
-          </w:tcPr>
-          <w:p>
-            <w:r>
-              <w:rPr>
-                <w:rFonts w:eastAsia="宋体"/>
-                <w:sz w:val="12"/>
-              </w:rPr>
-              <w:t>(nanoconfined Mg)</w:t>
-            </w:r>
-          </w:p>
-        </w:tc>
-        <w:tc>
-          <w:tcPr>
-            <w:tcW w:type="dxa" w:w="864"/>
-          </w:tcPr>
-          <w:p>
-            <w:r>
-              <w:rPr>
-                <w:rFonts w:eastAsia="宋体"/>
-                <w:sz w:val="12"/>
-              </w:rPr>
-              <w:t>3000</w:t>
-            </w:r>
-          </w:p>
-        </w:tc>
-        <w:tc>
-          <w:tcPr>
-            <w:tcW w:type="dxa" w:w="864"/>
-          </w:tcPr>
-          <w:p>
-            <w:r>
-              <w:rPr>
-                <w:rFonts w:eastAsia="宋体"/>
-                <w:sz w:val="12"/>
-              </w:rPr>
-              <w:t>NA</w:t>
-            </w:r>
-          </w:p>
-        </w:tc>
-        <w:tc>
-          <w:tcPr>
-            <w:tcW w:type="dxa" w:w="864"/>
-          </w:tcPr>
-          <w:p>
-            <w:r>
-              <w:rPr>
-                <w:rFonts w:eastAsia="宋体"/>
-                <w:sz w:val="12"/>
-              </w:rPr>
-              <w:t>NA</w:t>
-            </w:r>
-          </w:p>
-        </w:tc>
-        <w:tc>
-          <w:tcPr>
-            <w:tcW w:type="dxa" w:w="864"/>
-          </w:tcPr>
-          <w:p>
-            <w:r>
-              <w:rPr>
-                <w:rFonts w:eastAsia="宋体"/>
-                <w:sz w:val="12"/>
-              </w:rPr>
-              <w:t>1.0</w:t>
-            </w:r>
-          </w:p>
-        </w:tc>
-        <w:tc>
-          <w:tcPr>
-            <w:tcW w:type="dxa" w:w="864"/>
-          </w:tcPr>
-          <w:p>
-            <w:r>
-              <w:rPr>
-                <w:rFonts w:eastAsia="宋体"/>
-                <w:sz w:val="12"/>
-              </w:rPr>
-              <w:t>2026</w:t>
-            </w:r>
-          </w:p>
-        </w:tc>
-        <w:tc>
-          <w:tcPr>
-            <w:tcW w:type="dxa" w:w="864"/>
-          </w:tcPr>
-          <w:p>
-            <w:r>
-              <w:rPr>
-                <w:rFonts w:eastAsia="宋体"/>
-                <w:sz w:val="12"/>
-              </w:rPr>
-              <w:t>10.1002/adma.202520754</w:t>
-            </w:r>
-          </w:p>
-        </w:tc>
-        <w:tc>
-          <w:tcPr>
-            <w:tcW w:type="dxa" w:w="864"/>
-          </w:tcPr>
-          <w:p>
-            <w:r>
-              <w:rPr>
-                <w:rFonts w:eastAsia="宋体"/>
-                <w:sz w:val="12"/>
-              </w:rPr>
-              <w:t>low</w:t>
-            </w:r>
-          </w:p>
-        </w:tc>
-      </w:tr>
     </w:tbl>
     <w:p>
       <w:r>

</xml_diff>